<commit_message>
updates for Config, 1013, 6780
- Updated ADMV1013s Test Plan to reflect cable coloring
- Updated ADRF6780 to reflect cable coloring
- added supplies & sig gen to ADMV1013s config
- 1013s register reads still not working
</commit_message>
<xml_diff>
--- a/Test Plans/ADMV/ADMV1013s.docx
+++ b/Test Plans/ADMV/ADMV1013s.docx
@@ -1,6 +1,6 @@
 
 <file path=word/document.xml><?xml version="1.0" encoding="utf-8"?>
-<w:document xmlns:wpc="http://schemas.microsoft.com/office/word/2010/wordprocessingCanvas" xmlns:cx="http://schemas.microsoft.com/office/drawing/2014/chartex" xmlns:cx1="http://schemas.microsoft.com/office/drawing/2015/9/8/chartex" xmlns:cx2="http://schemas.microsoft.com/office/drawing/2015/10/21/chartex" xmlns:cx3="http://schemas.microsoft.com/office/drawing/2016/5/9/chartex" xmlns:cx4="http://schemas.microsoft.com/office/drawing/2016/5/10/chartex" xmlns:cx5="http://schemas.microsoft.com/office/drawing/2016/5/11/chartex" xmlns:cx6="http://schemas.microsoft.com/office/drawing/2016/5/12/chartex" xmlns:cx7="http://schemas.microsoft.com/office/drawing/2016/5/13/chartex" xmlns:cx8="http://schemas.microsoft.com/office/drawing/2016/5/14/chartex" xmlns:mc="http://schemas.openxmlformats.org/markup-compatibility/2006" xmlns:aink="http://schemas.microsoft.com/office/drawing/2016/ink" xmlns:am3d="http://schemas.microsoft.com/office/drawing/2017/model3d" xmlns:o="urn:schemas-microsoft-com:office:office" xmlns:oel="http://schemas.microsoft.com/office/2019/extlst" xmlns:r="http://schemas.openxmlformats.org/officeDocument/2006/relationships" xmlns:m="http://schemas.openxmlformats.org/officeDocument/2006/math" xmlns:v="urn:schemas-microsoft-com:vml" xmlns:wp14="http://schemas.microsoft.com/office/word/2010/wordprocessingDrawing" xmlns:wp="http://schemas.openxmlformats.org/drawingml/2006/wordprocessingDrawing" xmlns:w10="urn:schemas-microsoft-com:office:word" xmlns:w="http://schemas.openxmlformats.org/wordprocessingml/2006/main" xmlns:w14="http://schemas.microsoft.com/office/word/2010/wordml" xmlns:w15="http://schemas.microsoft.com/office/word/2012/wordml" xmlns:w16cex="http://schemas.microsoft.com/office/word/2018/wordml/cex" xmlns:w16cid="http://schemas.microsoft.com/office/word/2016/wordml/cid" xmlns:w16="http://schemas.microsoft.com/office/word/2018/wordml" xmlns:w16sdtdh="http://schemas.microsoft.com/office/word/2020/wordml/sdtdatahash" xmlns:w16se="http://schemas.microsoft.com/office/word/2015/wordml/symex" xmlns:wpg="http://schemas.microsoft.com/office/word/2010/wordprocessingGroup" xmlns:wpi="http://schemas.microsoft.com/office/word/2010/wordprocessingInk" xmlns:wne="http://schemas.microsoft.com/office/word/2006/wordml" xmlns:wps="http://schemas.microsoft.com/office/word/2010/wordprocessingShape" mc:Ignorable="w14 w15 w16se w16cid w16 w16cex w16sdtdh wp14">
+<w:document xmlns:wpc="http://schemas.microsoft.com/office/word/2010/wordprocessingCanvas" xmlns:cx="http://schemas.microsoft.com/office/drawing/2014/chartex" xmlns:cx1="http://schemas.microsoft.com/office/drawing/2015/9/8/chartex" xmlns:cx2="http://schemas.microsoft.com/office/drawing/2015/10/21/chartex" xmlns:cx3="http://schemas.microsoft.com/office/drawing/2016/5/9/chartex" xmlns:cx4="http://schemas.microsoft.com/office/drawing/2016/5/10/chartex" xmlns:cx5="http://schemas.microsoft.com/office/drawing/2016/5/11/chartex" xmlns:cx6="http://schemas.microsoft.com/office/drawing/2016/5/12/chartex" xmlns:cx7="http://schemas.microsoft.com/office/drawing/2016/5/13/chartex" xmlns:cx8="http://schemas.microsoft.com/office/drawing/2016/5/14/chartex" xmlns:mc="http://schemas.openxmlformats.org/markup-compatibility/2006" xmlns:aink="http://schemas.microsoft.com/office/drawing/2016/ink" xmlns:am3d="http://schemas.microsoft.com/office/drawing/2017/model3d" xmlns:o="urn:schemas-microsoft-com:office:office" xmlns:oel="http://schemas.microsoft.com/office/2019/extlst" xmlns:r="http://schemas.openxmlformats.org/officeDocument/2006/relationships" xmlns:m="http://schemas.openxmlformats.org/officeDocument/2006/math" xmlns:v="urn:schemas-microsoft-com:vml" xmlns:wp14="http://schemas.microsoft.com/office/word/2010/wordprocessingDrawing" xmlns:wp="http://schemas.openxmlformats.org/drawingml/2006/wordprocessingDrawing" xmlns:w10="urn:schemas-microsoft-com:office:word" xmlns:w="http://schemas.openxmlformats.org/wordprocessingml/2006/main" xmlns:w14="http://schemas.microsoft.com/office/word/2010/wordml" xmlns:w15="http://schemas.microsoft.com/office/word/2012/wordml" xmlns:w16cex="http://schemas.microsoft.com/office/word/2018/wordml/cex" xmlns:w16cid="http://schemas.microsoft.com/office/word/2016/wordml/cid" xmlns:w16="http://schemas.microsoft.com/office/word/2018/wordml" xmlns:w16du="http://schemas.microsoft.com/office/word/2023/wordml/word16du" xmlns:w16sdtdh="http://schemas.microsoft.com/office/word/2020/wordml/sdtdatahash" xmlns:w16sdtfl="http://schemas.microsoft.com/office/word/2024/wordml/sdtformatlock" xmlns:w16se="http://schemas.microsoft.com/office/word/2015/wordml/symex" xmlns:wpg="http://schemas.microsoft.com/office/word/2010/wordprocessingGroup" xmlns:wpi="http://schemas.microsoft.com/office/word/2010/wordprocessingInk" xmlns:wne="http://schemas.microsoft.com/office/word/2006/wordml" xmlns:wps="http://schemas.microsoft.com/office/word/2010/wordprocessingShape" mc:Ignorable="w14 w15 w16se w16cid w16 w16cex w16sdtdh w16sdtfl w16du wp14">
   <w:body>
     <w:p>
       <w:pPr>
@@ -107,6 +107,8 @@
         </w:drawing>
       </w:r>
     </w:p>
+    <w:p/>
+    <w:p/>
     <w:p>
       <w:pPr>
         <w:pStyle w:val="ListParagraph"/>
@@ -189,6 +191,9 @@
               <w:ind w:left="0"/>
             </w:pPr>
             <w:r>
+              <w:t xml:space="preserve">Red </w:t>
+            </w:r>
+            <w:r>
               <w:t>5v</w:t>
             </w:r>
           </w:p>
@@ -225,6 +230,9 @@
               <w:ind w:left="0"/>
             </w:pPr>
             <w:r>
+              <w:t xml:space="preserve">Orange </w:t>
+            </w:r>
+            <w:r>
               <w:t>3.3</w:t>
             </w:r>
           </w:p>
@@ -261,6 +269,9 @@
               <w:ind w:left="0"/>
             </w:pPr>
             <w:r>
+              <w:t xml:space="preserve">Yellow </w:t>
+            </w:r>
+            <w:r>
               <w:t>1.8v</w:t>
             </w:r>
           </w:p>
@@ -283,39 +294,6 @@
           </w:p>
         </w:tc>
       </w:tr>
-      <w:tr>
-        <w:trPr>
-          <w:trHeight w:val="292"/>
-        </w:trPr>
-        <w:tc>
-          <w:tcPr>
-            <w:tcW w:w="4345" w:type="dxa"/>
-          </w:tcPr>
-          <w:p>
-            <w:pPr>
-              <w:pStyle w:val="ListParagraph"/>
-              <w:ind w:left="0"/>
-            </w:pPr>
-            <w:r>
-              <w:t>VCTRL1</w:t>
-            </w:r>
-          </w:p>
-        </w:tc>
-        <w:tc>
-          <w:tcPr>
-            <w:tcW w:w="4298" w:type="dxa"/>
-          </w:tcPr>
-          <w:p>
-            <w:pPr>
-              <w:pStyle w:val="ListParagraph"/>
-              <w:ind w:left="0"/>
-            </w:pPr>
-            <w:r>
-              <w:t>CH0 (4163 card)</w:t>
-            </w:r>
-          </w:p>
-        </w:tc>
-      </w:tr>
     </w:tbl>
     <w:p>
       <w:pPr>
@@ -399,6 +377,9 @@
         <w:t xml:space="preserve">, channel name = </w:t>
       </w:r>
       <w:r>
+        <w:t xml:space="preserve">Red </w:t>
+      </w:r>
+      <w:r>
         <w:t>5</w:t>
       </w:r>
       <w:r>
@@ -435,6 +416,9 @@
         <w:t xml:space="preserve">v, channel name = </w:t>
       </w:r>
       <w:r>
+        <w:t xml:space="preserve">Orange </w:t>
+      </w:r>
+      <w:r>
         <w:t>3.3</w:t>
       </w:r>
       <w:r>
@@ -462,31 +446,13 @@
         </w:numPr>
       </w:pPr>
       <w:r>
-        <w:t>Voltage = 1.8v, channel name = 1.8v</w:t>
-      </w:r>
-    </w:p>
-    <w:p>
-      <w:pPr>
-        <w:pStyle w:val="ListParagraph"/>
-        <w:numPr>
-          <w:ilvl w:val="1"/>
-          <w:numId w:val="1"/>
-        </w:numPr>
-      </w:pPr>
-      <w:r>
-        <w:t>CH0 (4163 card)</w:t>
-      </w:r>
-    </w:p>
-    <w:p>
-      <w:pPr>
-        <w:pStyle w:val="ListParagraph"/>
-        <w:numPr>
-          <w:ilvl w:val="2"/>
-          <w:numId w:val="1"/>
-        </w:numPr>
-      </w:pPr>
-      <w:r>
-        <w:t>Voltage = 1.8v, channel name = 1.8v VCTRL</w:t>
+        <w:t xml:space="preserve">Voltage = 1.8v, channel name = </w:t>
+      </w:r>
+      <w:r>
+        <w:t xml:space="preserve">Yellow </w:t>
+      </w:r>
+      <w:r>
+        <w:t>1.8v</w:t>
       </w:r>
     </w:p>
     <w:p>
@@ -679,6 +645,9 @@
           </w:tcPr>
           <w:p>
             <w:r>
+              <w:t xml:space="preserve">Red </w:t>
+            </w:r>
+            <w:r>
               <w:t>5v</w:t>
             </w:r>
           </w:p>
@@ -689,6 +658,9 @@
           </w:tcPr>
           <w:p>
             <w:r>
+              <w:t xml:space="preserve">Orange </w:t>
+            </w:r>
+            <w:r>
               <w:t>3.3v</w:t>
             </w:r>
           </w:p>
@@ -698,6 +670,9 @@
             <w:tcW w:w="3117" w:type="dxa"/>
           </w:tcPr>
           <w:p>
+            <w:r>
+              <w:t xml:space="preserve">Yellow </w:t>
+            </w:r>
             <w:r>
               <w:t>1.8v</w:t>
             </w:r>
@@ -711,10 +686,10 @@
           </w:tcPr>
           <w:p>
             <w:r>
-              <w:t>~1</w:t>
-            </w:r>
-            <w:r>
-              <w:t>5</w:t>
+              <w:t>~</w:t>
+            </w:r>
+            <w:r>
+              <w:t>20</w:t>
             </w:r>
             <w:r>
               <w:t>mA</w:t>
@@ -782,6 +757,9 @@
     </w:p>
     <w:p>
       <w:r>
+        <w:rPr>
+          <w:noProof/>
+        </w:rPr>
         <w:drawing>
           <wp:inline distT="0" distB="0" distL="0" distR="0" wp14:anchorId="3E038353" wp14:editId="3A3F357F">
             <wp:extent cx="5222731" cy="3686175"/>
@@ -872,6 +850,9 @@
           </w:tcPr>
           <w:p>
             <w:r>
+              <w:t xml:space="preserve">Red </w:t>
+            </w:r>
+            <w:r>
               <w:t>5v</w:t>
             </w:r>
           </w:p>
@@ -882,6 +863,9 @@
           </w:tcPr>
           <w:p>
             <w:r>
+              <w:t xml:space="preserve">Orange </w:t>
+            </w:r>
+            <w:r>
               <w:t>3.3v</w:t>
             </w:r>
           </w:p>
@@ -891,6 +875,9 @@
             <w:tcW w:w="3117" w:type="dxa"/>
           </w:tcPr>
           <w:p>
+            <w:r>
+              <w:t xml:space="preserve">Yellow </w:t>
+            </w:r>
             <w:r>
               <w:t>1.8v</w:t>
             </w:r>
@@ -923,10 +910,26 @@
               <w:t>~</w:t>
             </w:r>
             <w:r>
+              <w:t>380mA (</w:t>
+            </w:r>
+            <w:r>
               <w:t>555</w:t>
             </w:r>
             <w:r>
-              <w:t>mA</w:t>
+              <w:t xml:space="preserve"> w/ </w:t>
+            </w:r>
+            <w:proofErr w:type="spellStart"/>
+            <w:proofErr w:type="gramStart"/>
+            <w:r>
+              <w:t>vctrl</w:t>
+            </w:r>
+            <w:proofErr w:type="spellEnd"/>
+            <w:r>
+              <w:t xml:space="preserve"> @</w:t>
+            </w:r>
+            <w:proofErr w:type="gramEnd"/>
+            <w:r>
+              <w:t>1.8)</w:t>
             </w:r>
           </w:p>
         </w:tc>
@@ -972,10 +975,10 @@
         <w:t>7</w:t>
       </w:r>
       <w:r>
-        <w:t xml:space="preserve"> GHz, either can be visible. Fine if both are visible.</w:t>
-      </w:r>
-      <w:r>
-        <w:t xml:space="preserve"> </w:t>
+        <w:t xml:space="preserve"> GHz, </w:t>
+      </w:r>
+      <w:r>
+        <w:t>should be around -21dBm</w:t>
       </w:r>
     </w:p>
     <w:p>
@@ -1024,7 +1027,7 @@
 </file>
 
 <file path=word/numbering.xml><?xml version="1.0" encoding="utf-8"?>
-<w:numbering xmlns:wpc="http://schemas.microsoft.com/office/word/2010/wordprocessingCanvas" xmlns:cx="http://schemas.microsoft.com/office/drawing/2014/chartex" xmlns:cx1="http://schemas.microsoft.com/office/drawing/2015/9/8/chartex" xmlns:cx2="http://schemas.microsoft.com/office/drawing/2015/10/21/chartex" xmlns:cx3="http://schemas.microsoft.com/office/drawing/2016/5/9/chartex" xmlns:cx4="http://schemas.microsoft.com/office/drawing/2016/5/10/chartex" xmlns:cx5="http://schemas.microsoft.com/office/drawing/2016/5/11/chartex" xmlns:cx6="http://schemas.microsoft.com/office/drawing/2016/5/12/chartex" xmlns:cx7="http://schemas.microsoft.com/office/drawing/2016/5/13/chartex" xmlns:cx8="http://schemas.microsoft.com/office/drawing/2016/5/14/chartex" xmlns:mc="http://schemas.openxmlformats.org/markup-compatibility/2006" xmlns:aink="http://schemas.microsoft.com/office/drawing/2016/ink" xmlns:am3d="http://schemas.microsoft.com/office/drawing/2017/model3d" xmlns:o="urn:schemas-microsoft-com:office:office" xmlns:oel="http://schemas.microsoft.com/office/2019/extlst" xmlns:r="http://schemas.openxmlformats.org/officeDocument/2006/relationships" xmlns:m="http://schemas.openxmlformats.org/officeDocument/2006/math" xmlns:v="urn:schemas-microsoft-com:vml" xmlns:wp14="http://schemas.microsoft.com/office/word/2010/wordprocessingDrawing" xmlns:wp="http://schemas.openxmlformats.org/drawingml/2006/wordprocessingDrawing" xmlns:w10="urn:schemas-microsoft-com:office:word" xmlns:w="http://schemas.openxmlformats.org/wordprocessingml/2006/main" xmlns:w14="http://schemas.microsoft.com/office/word/2010/wordml" xmlns:w15="http://schemas.microsoft.com/office/word/2012/wordml" xmlns:w16cex="http://schemas.microsoft.com/office/word/2018/wordml/cex" xmlns:w16cid="http://schemas.microsoft.com/office/word/2016/wordml/cid" xmlns:w16="http://schemas.microsoft.com/office/word/2018/wordml" xmlns:w16sdtdh="http://schemas.microsoft.com/office/word/2020/wordml/sdtdatahash" xmlns:w16se="http://schemas.microsoft.com/office/word/2015/wordml/symex" xmlns:wpg="http://schemas.microsoft.com/office/word/2010/wordprocessingGroup" xmlns:wpi="http://schemas.microsoft.com/office/word/2010/wordprocessingInk" xmlns:wne="http://schemas.microsoft.com/office/word/2006/wordml" xmlns:wps="http://schemas.microsoft.com/office/word/2010/wordprocessingShape" mc:Ignorable="w14 w15 w16se w16cid w16 w16cex w16sdtdh wp14">
+<w:numbering xmlns:wpc="http://schemas.microsoft.com/office/word/2010/wordprocessingCanvas" xmlns:cx="http://schemas.microsoft.com/office/drawing/2014/chartex" xmlns:cx1="http://schemas.microsoft.com/office/drawing/2015/9/8/chartex" xmlns:cx2="http://schemas.microsoft.com/office/drawing/2015/10/21/chartex" xmlns:cx3="http://schemas.microsoft.com/office/drawing/2016/5/9/chartex" xmlns:cx4="http://schemas.microsoft.com/office/drawing/2016/5/10/chartex" xmlns:cx5="http://schemas.microsoft.com/office/drawing/2016/5/11/chartex" xmlns:cx6="http://schemas.microsoft.com/office/drawing/2016/5/12/chartex" xmlns:cx7="http://schemas.microsoft.com/office/drawing/2016/5/13/chartex" xmlns:cx8="http://schemas.microsoft.com/office/drawing/2016/5/14/chartex" xmlns:mc="http://schemas.openxmlformats.org/markup-compatibility/2006" xmlns:aink="http://schemas.microsoft.com/office/drawing/2016/ink" xmlns:am3d="http://schemas.microsoft.com/office/drawing/2017/model3d" xmlns:o="urn:schemas-microsoft-com:office:office" xmlns:oel="http://schemas.microsoft.com/office/2019/extlst" xmlns:r="http://schemas.openxmlformats.org/officeDocument/2006/relationships" xmlns:m="http://schemas.openxmlformats.org/officeDocument/2006/math" xmlns:v="urn:schemas-microsoft-com:vml" xmlns:wp14="http://schemas.microsoft.com/office/word/2010/wordprocessingDrawing" xmlns:wp="http://schemas.openxmlformats.org/drawingml/2006/wordprocessingDrawing" xmlns:w10="urn:schemas-microsoft-com:office:word" xmlns:w="http://schemas.openxmlformats.org/wordprocessingml/2006/main" xmlns:w14="http://schemas.microsoft.com/office/word/2010/wordml" xmlns:w15="http://schemas.microsoft.com/office/word/2012/wordml" xmlns:w16cex="http://schemas.microsoft.com/office/word/2018/wordml/cex" xmlns:w16cid="http://schemas.microsoft.com/office/word/2016/wordml/cid" xmlns:w16="http://schemas.microsoft.com/office/word/2018/wordml" xmlns:w16du="http://schemas.microsoft.com/office/word/2023/wordml/word16du" xmlns:w16sdtdh="http://schemas.microsoft.com/office/word/2020/wordml/sdtdatahash" xmlns:w16sdtfl="http://schemas.microsoft.com/office/word/2024/wordml/sdtformatlock" xmlns:w16se="http://schemas.microsoft.com/office/word/2015/wordml/symex" xmlns:wpg="http://schemas.microsoft.com/office/word/2010/wordprocessingGroup" xmlns:wpi="http://schemas.microsoft.com/office/word/2010/wordprocessingInk" xmlns:wne="http://schemas.microsoft.com/office/word/2006/wordml" xmlns:wps="http://schemas.microsoft.com/office/word/2010/wordprocessingShape" mc:Ignorable="w14 w15 w16se w16cid w16 w16cex w16sdtdh w16sdtfl w16du wp14">
   <w:abstractNum w:abstractNumId="0" w15:restartNumberingAfterBreak="0">
     <w:nsid w:val="12DD560D"/>
     <w:multiLevelType w:val="hybridMultilevel"/>
@@ -1412,7 +1415,7 @@
 </file>
 
 <file path=word/styles.xml><?xml version="1.0" encoding="utf-8"?>
-<w:styles xmlns:mc="http://schemas.openxmlformats.org/markup-compatibility/2006" xmlns:r="http://schemas.openxmlformats.org/officeDocument/2006/relationships" xmlns:w="http://schemas.openxmlformats.org/wordprocessingml/2006/main" xmlns:w14="http://schemas.microsoft.com/office/word/2010/wordml" xmlns:w15="http://schemas.microsoft.com/office/word/2012/wordml" xmlns:w16cex="http://schemas.microsoft.com/office/word/2018/wordml/cex" xmlns:w16cid="http://schemas.microsoft.com/office/word/2016/wordml/cid" xmlns:w16="http://schemas.microsoft.com/office/word/2018/wordml" xmlns:w16sdtdh="http://schemas.microsoft.com/office/word/2020/wordml/sdtdatahash" xmlns:w16se="http://schemas.microsoft.com/office/word/2015/wordml/symex" mc:Ignorable="w14 w15 w16se w16cid w16 w16cex w16sdtdh">
+<w:styles xmlns:mc="http://schemas.openxmlformats.org/markup-compatibility/2006" xmlns:r="http://schemas.openxmlformats.org/officeDocument/2006/relationships" xmlns:w="http://schemas.openxmlformats.org/wordprocessingml/2006/main" xmlns:w14="http://schemas.microsoft.com/office/word/2010/wordml" xmlns:w15="http://schemas.microsoft.com/office/word/2012/wordml" xmlns:w16cex="http://schemas.microsoft.com/office/word/2018/wordml/cex" xmlns:w16cid="http://schemas.microsoft.com/office/word/2016/wordml/cid" xmlns:w16="http://schemas.microsoft.com/office/word/2018/wordml" xmlns:w16du="http://schemas.microsoft.com/office/word/2023/wordml/word16du" xmlns:w16sdtdh="http://schemas.microsoft.com/office/word/2020/wordml/sdtdatahash" xmlns:w16sdtfl="http://schemas.microsoft.com/office/word/2024/wordml/sdtformatlock" xmlns:w16se="http://schemas.microsoft.com/office/word/2015/wordml/symex" mc:Ignorable="w14 w15 w16se w16cid w16 w16cex w16sdtdh w16sdtfl w16du">
   <w:docDefaults>
     <w:rPrDefault>
       <w:rPr>

</xml_diff>